<commit_message>
Reyting sentabr oyi uchun
</commit_message>
<xml_diff>
--- a/Reyting 2025-2026/Reyting Isakov M. Oktabr.docx
+++ b/Reyting 2025-2026/Reyting Isakov M. Oktabr.docx
@@ -179,8 +179,6 @@
         </w:rPr>
         <w:t>-</w:t>
       </w:r>
-      <w:bookmarkStart w:id="0" w:name="_GoBack"/>
-      <w:bookmarkEnd w:id="0"/>
       <w:r>
         <w:rPr>
           <w:sz w:val="28"/>
@@ -662,7 +660,7 @@
               <w:rPr>
                 <w:lang w:val="en-US"/>
               </w:rPr>
-              <w:t>8</w:t>
+              <w:t>4</w:t>
             </w:r>
           </w:p>
         </w:tc>
@@ -709,7 +707,7 @@
               <w:rPr>
                 <w:lang w:val="en-US"/>
               </w:rPr>
-              <w:t>8</w:t>
+              <w:t>4</w:t>
             </w:r>
           </w:p>
         </w:tc>
@@ -788,7 +786,13 @@
               <w:rPr>
                 <w:lang w:val="en-US"/>
               </w:rPr>
-              <w:t>10</w:t>
+              <w:t>2</w:t>
+            </w:r>
+            <w:r>
+              <w:rPr>
+                <w:lang w:val="en-US"/>
+              </w:rPr>
+              <w:t>0</w:t>
             </w:r>
           </w:p>
         </w:tc>
@@ -835,7 +839,13 @@
               <w:rPr>
                 <w:lang w:val="en-US"/>
               </w:rPr>
-              <w:t>10</w:t>
+              <w:t>2</w:t>
+            </w:r>
+            <w:r>
+              <w:rPr>
+                <w:lang w:val="en-US"/>
+              </w:rPr>
+              <w:t>0</w:t>
             </w:r>
           </w:p>
         </w:tc>
@@ -1159,7 +1169,7 @@
               <w:rPr>
                 <w:lang w:val="en-US"/>
               </w:rPr>
-              <w:t>0</w:t>
+              <w:t>32</w:t>
             </w:r>
           </w:p>
         </w:tc>
@@ -1206,7 +1216,7 @@
               <w:rPr>
                 <w:lang w:val="en-US"/>
               </w:rPr>
-              <w:t>0</w:t>
+              <w:t>32</w:t>
             </w:r>
           </w:p>
         </w:tc>
@@ -1425,7 +1435,7 @@
                 <w:b/>
                 <w:lang w:val="en-US"/>
               </w:rPr>
-              <w:t>18</w:t>
+              <w:t>56</w:t>
             </w:r>
           </w:p>
         </w:tc>
@@ -1575,6 +1585,12 @@
               <w:rPr>
                 <w:lang w:val="en-US"/>
               </w:rPr>
+              <w:t xml:space="preserve"> </w:t>
+            </w:r>
+            <w:r>
+              <w:rPr>
+                <w:lang w:val="en-US"/>
+              </w:rPr>
               <w:t>ball</w:t>
             </w:r>
           </w:p>
@@ -1696,6 +1712,18 @@
               </w:rPr>
               <w:t>0,5</w:t>
             </w:r>
+            <w:r>
+              <w:rPr>
+                <w:lang w:val="en-US"/>
+              </w:rPr>
+              <w:t xml:space="preserve"> </w:t>
+            </w:r>
+            <w:r>
+              <w:rPr>
+                <w:lang w:val="en-US"/>
+              </w:rPr>
+              <w:t>ball</w:t>
+            </w:r>
           </w:p>
         </w:tc>
         <w:tc>
@@ -1815,6 +1843,18 @@
               </w:rPr>
               <w:t>0,5</w:t>
             </w:r>
+            <w:r>
+              <w:rPr>
+                <w:lang w:val="en-US"/>
+              </w:rPr>
+              <w:t xml:space="preserve"> </w:t>
+            </w:r>
+            <w:r>
+              <w:rPr>
+                <w:lang w:val="en-US"/>
+              </w:rPr>
+              <w:t>ball</w:t>
+            </w:r>
           </w:p>
         </w:tc>
         <w:tc>
@@ -1934,6 +1974,18 @@
               </w:rPr>
               <w:t>0,5</w:t>
             </w:r>
+            <w:r>
+              <w:rPr>
+                <w:lang w:val="en-US"/>
+              </w:rPr>
+              <w:t xml:space="preserve"> </w:t>
+            </w:r>
+            <w:r>
+              <w:rPr>
+                <w:lang w:val="en-US"/>
+              </w:rPr>
+              <w:t>ball</w:t>
+            </w:r>
           </w:p>
         </w:tc>
         <w:tc>
@@ -2528,7 +2580,19 @@
               <w:rPr>
                 <w:lang w:val="en-US"/>
               </w:rPr>
-              <w:t>, integratsiyalashgan ma’ruza va mahurat (master</w:t>
+              <w:t>, integratsiyalashgan ma’ruza va mah</w:t>
+            </w:r>
+            <w:r>
+              <w:rPr>
+                <w:lang w:val="en-US"/>
+              </w:rPr>
+              <w:t>o</w:t>
+            </w:r>
+            <w:r>
+              <w:rPr>
+                <w:lang w:val="en-US"/>
+              </w:rPr>
+              <w:t>rat (master</w:t>
             </w:r>
             <w:r>
               <w:rPr>
@@ -2547,18 +2611,6 @@
                 <w:lang w:val="en-US"/>
               </w:rPr>
               <w:t xml:space="preserve"> darslarini o‘tkazish</w:t>
-            </w:r>
-            <w:r>
-              <w:rPr>
-                <w:lang w:val="en-US"/>
-              </w:rPr>
-              <w:t xml:space="preserve"> </w:t>
-            </w:r>
-            <w:r>
-              <w:rPr>
-                <w:lang w:val="en-US"/>
-              </w:rPr>
-              <w:t xml:space="preserve">  </w:t>
             </w:r>
           </w:p>
         </w:tc>
@@ -3232,7 +3284,19 @@
               <w:rPr>
                 <w:lang w:val="en-US"/>
               </w:rPr>
-              <w:t xml:space="preserve"> va electron modul papkasini yaratish</w:t>
+              <w:t xml:space="preserve"> va ele</w:t>
+            </w:r>
+            <w:r>
+              <w:rPr>
+                <w:lang w:val="en-US"/>
+              </w:rPr>
+              <w:t>k</w:t>
+            </w:r>
+            <w:r>
+              <w:rPr>
+                <w:lang w:val="en-US"/>
+              </w:rPr>
+              <w:t>tron modul papkasini yaratish</w:t>
             </w:r>
           </w:p>
         </w:tc>
@@ -3388,7 +3452,7 @@
               <w:rPr>
                 <w:lang w:val="en-US"/>
               </w:rPr>
-              <w:t>ishlab chiqish va nashir etish</w:t>
+              <w:t>ishlab chiqish va nashr etish</w:t>
             </w:r>
           </w:p>
         </w:tc>
@@ -3410,7 +3474,7 @@
               <w:rPr>
                 <w:lang w:val="en-US"/>
               </w:rPr>
-              <w:t>1</w:t>
+              <w:t>0</w:t>
             </w:r>
           </w:p>
         </w:tc>
@@ -3453,12 +3517,6 @@
                 <w:lang w:val="en-US"/>
               </w:rPr>
             </w:pPr>
-            <w:r>
-              <w:rPr>
-                <w:lang w:val="en-US"/>
-              </w:rPr>
-              <w:t>3</w:t>
-            </w:r>
             <w:r>
               <w:rPr>
                 <w:lang w:val="en-US"/>
@@ -4121,7 +4179,7 @@
                 <w:b/>
                 <w:lang w:val="en-US"/>
               </w:rPr>
-              <w:t>6</w:t>
+              <w:t>3</w:t>
             </w:r>
             <w:r>
               <w:rPr>
@@ -4404,7 +4462,7 @@
                 <w:bCs/>
                 <w:lang w:val="en-US"/>
               </w:rPr>
-              <w:t>2</w:t>
+              <w:t>1</w:t>
             </w:r>
           </w:p>
         </w:tc>
@@ -4447,7 +4505,7 @@
               <w:rPr>
                 <w:lang w:val="en-US"/>
               </w:rPr>
-              <w:t>2</w:t>
+              <w:t>1</w:t>
             </w:r>
             <w:r>
               <w:rPr>
@@ -5321,7 +5379,7 @@
                 <w:b/>
                 <w:lang w:val="en-US"/>
               </w:rPr>
-              <w:t>2</w:t>
+              <w:t>1</w:t>
             </w:r>
             <w:r>
               <w:rPr>
@@ -5468,7 +5526,7 @@
               <w:rPr>
                 <w:lang w:val="en-US"/>
               </w:rPr>
-              <w:t xml:space="preserve">Kursant tinglovchilarni O‘z. Res. Pr.ning davlat stipendiyasi, boshqa turdagi davlat stipendiyalari, xalqaro va Res. olimpiadalari tanlovlari, musobaqalariga tayyorlash.    </w:t>
+              <w:t>Kursant tinglovchilarni O‘z. Res. Pr.ning davlat stipendiyasi, boshqa turdagi davlat stipendiyalari, xalqaro va Res. olimpiadalari tanlovlari, musobaqalariga tayyorlash.</w:t>
             </w:r>
           </w:p>
         </w:tc>
@@ -5490,7 +5548,7 @@
               <w:rPr>
                 <w:lang w:val="en-US"/>
               </w:rPr>
-              <w:t>2</w:t>
+              <w:t>5</w:t>
             </w:r>
           </w:p>
         </w:tc>
@@ -5533,13 +5591,7 @@
               <w:rPr>
                 <w:lang w:val="en-US"/>
               </w:rPr>
-              <w:t>4</w:t>
-            </w:r>
-            <w:r>
-              <w:rPr>
-                <w:lang w:val="en-US"/>
-              </w:rPr>
-              <w:t>0</w:t>
+              <w:t>100</w:t>
             </w:r>
           </w:p>
         </w:tc>
@@ -6061,7 +6113,7 @@
                 <w:b/>
                 <w:lang w:val="en-US"/>
               </w:rPr>
-              <w:t>4</w:t>
+              <w:t>10</w:t>
             </w:r>
             <w:r>
               <w:rPr>
@@ -6900,7 +6952,7 @@
               <w:rPr>
                 <w:lang w:val="en-US"/>
               </w:rPr>
-              <w:t>1</w:t>
+              <w:t>0</w:t>
             </w:r>
           </w:p>
         </w:tc>
@@ -6943,7 +6995,7 @@
               <w:rPr>
                 <w:lang w:val="en-US"/>
               </w:rPr>
-              <w:t>20</w:t>
+              <w:t>0</w:t>
             </w:r>
           </w:p>
         </w:tc>
@@ -7150,13 +7202,6 @@
                 <w:lang w:val="en-US"/>
               </w:rPr>
             </w:pPr>
-            <w:r>
-              <w:rPr>
-                <w:b/>
-                <w:lang w:val="en-US"/>
-              </w:rPr>
-              <w:t>2</w:t>
-            </w:r>
             <w:r>
               <w:rPr>
                 <w:b/>
@@ -7224,15 +7269,10 @@
                 <w:b/>
                 <w:lang w:val="en-US"/>
               </w:rPr>
-              <w:t>1</w:t>
-            </w:r>
-            <w:r>
-              <w:rPr>
-                <w:b/>
-                <w:lang w:val="en-US"/>
-              </w:rPr>
-              <w:t>75</w:t>
-            </w:r>
+              <w:t>210</w:t>
+            </w:r>
+            <w:bookmarkStart w:id="0" w:name="_GoBack"/>
+            <w:bookmarkEnd w:id="0"/>
           </w:p>
         </w:tc>
         <w:tc>

</xml_diff>